<commit_message>
Clarify category reset in lab 2 reference
</commit_message>
<xml_diff>
--- a/materials/lab-02/reference/description.docx
+++ b/materials/lab-02/reference/description.docx
@@ -386,7 +386,7 @@
                 <w:rFonts w:ascii="Liberation Sans" w:hAnsi="Liberation Sans"/>
                 <w:sz w:val="18"/>
               </w:rPr>
-              <w:t>Появляется заявка №103 со статусом «Получена». Поля формы очищаются.</w:t>
+              <w:t>Появляется заявка №103 со статусом «Получена». Поля аудитории и описания пусты; категория снова «Оборудование».</w:t>
             </w:r>
           </w:p>
         </w:tc>
@@ -1069,7 +1069,7 @@
                 <w:rFonts w:ascii="Liberation Sans" w:hAnsi="Liberation Sans"/>
                 <w:sz w:val="18"/>
               </w:rPr>
-              <w:t>Создаётся заявка с очередным номером и статусом «Получена». Она появляется в общем списке, форма очищается.</w:t>
+              <w:t>Создаётся заявка с очередным номером и статусом «Получена». Она появляется в общем списке. Поля аудитории и описания очищаются, категория возвращается к «Оборудование».</w:t>
             </w:r>
           </w:p>
         </w:tc>

</xml_diff>